<commit_message>
docs: fix SRS-EN cover page to plain white/black style
Same correction as the dynamic-views documents: the cover should not
be a dark full-page block, only the accent colors moved away from
navy blue.

Co-Authored-By: Claude Sonnet 5 <noreply@anthropic.com>
</commit_message>
<xml_diff>
--- a/01-informe-especificacion-requisitos/SRS-EN.docx
+++ b/01-informe-especificacion-requisitos/SRS-EN.docx
@@ -2,134 +2,94 @@
 <file path=word/document.xml><?xml version="1.0" encoding="utf-8"?>
 <w:document xmlns:wpc="http://schemas.microsoft.com/office/word/2010/wordprocessingCanvas" xmlns:mc="http://schemas.openxmlformats.org/markup-compatibility/2006" xmlns:o="urn:schemas-microsoft-com:office:office" xmlns:r="http://schemas.openxmlformats.org/officeDocument/2006/relationships" xmlns:m="http://schemas.openxmlformats.org/officeDocument/2006/math" xmlns:v="urn:schemas-microsoft-com:vml" xmlns:wp14="http://schemas.microsoft.com/office/word/2010/wordprocessingDrawing" xmlns:wp="http://schemas.openxmlformats.org/drawingml/2006/wordprocessingDrawing" xmlns:w10="urn:schemas-microsoft-com:office:word" xmlns:w="http://schemas.openxmlformats.org/wordprocessingml/2006/main" xmlns:w14="http://schemas.microsoft.com/office/word/2010/wordml" xmlns:w15="http://schemas.microsoft.com/office/word/2012/wordml" xmlns:wpg="http://schemas.microsoft.com/office/word/2010/wordprocessingGroup" xmlns:wpi="http://schemas.microsoft.com/office/word/2010/wordprocessingInk" xmlns:wne="http://schemas.microsoft.com/office/word/2006/wordml" xmlns:wps="http://schemas.microsoft.com/office/word/2010/wordprocessingShape" xmlns:cx="http://schemas.microsoft.com/office/drawing/2014/chartex" xmlns:cx1="http://schemas.microsoft.com/office/drawing/2015/9/8/chartex" xmlns:cx2="http://schemas.microsoft.com/office/drawing/2015/10/21/chartex" xmlns:cx3="http://schemas.microsoft.com/office/drawing/2016/5/9/chartex" xmlns:cx4="http://schemas.microsoft.com/office/drawing/2016/5/10/chartex" xmlns:cx5="http://schemas.microsoft.com/office/drawing/2016/5/11/chartex" xmlns:cx6="http://schemas.microsoft.com/office/drawing/2016/5/12/chartex" xmlns:cx7="http://schemas.microsoft.com/office/drawing/2016/5/13/chartex" xmlns:cx8="http://schemas.microsoft.com/office/drawing/2016/5/14/chartex" xmlns:aink="http://schemas.microsoft.com/office/drawing/2016/ink" xmlns:am3d="http://schemas.microsoft.com/office/drawing/2017/model3d" xmlns:w16cex="http://schemas.microsoft.com/office/word/2018/wordml/cex" xmlns:w16cid="http://schemas.microsoft.com/office/word/2016/wordml/cid" xmlns:w16="http://schemas.microsoft.com/office/word/2018/wordml" xmlns:w16sdtdh="http://schemas.microsoft.com/office/word/2020/wordml/sdtdatahash" xmlns:w16se="http://schemas.microsoft.com/office/word/2015/wordml/symex" mc:Ignorable="w14 w15 wp14">
   <w:body>
-    <w:tbl>
-      <w:tblPr>
-        <w:tblW w:type="dxa" w:w="9026"/>
-        <w:tblBorders>
-          <w:top w:val="none" w:color="FFFFFF" w:sz="0"/>
-          <w:left w:val="none" w:color="FFFFFF" w:sz="0"/>
-          <w:bottom w:val="none" w:color="FFFFFF" w:sz="0"/>
-          <w:right w:val="none" w:color="FFFFFF" w:sz="0"/>
-          <w:insideH w:val="none" w:color="FFFFFF" w:sz="0"/>
-          <w:insideV w:val="none" w:color="FFFFFF" w:sz="0"/>
-        </w:tblBorders>
-      </w:tblPr>
-      <w:tblGrid>
-        <w:gridCol w:w="9026"/>
-      </w:tblGrid>
-      <w:tr>
-        <w:trPr>
-          <w:trHeight w:val="13600" w:hRule="exact"/>
-        </w:trPr>
-        <w:tc>
-          <w:tcPr>
-            <w:tcW w:type="dxa" w:w="9026"/>
-            <w:shd w:fill="0B0B0B" w:val="clear"/>
-            <w:tcMar>
-              <w:top w:type="dxa" w:w="200"/>
-              <w:left w:type="dxa" w:w="400"/>
-              <w:bottom w:type="dxa" w:w="200"/>
-              <w:right w:type="dxa" w:w="400"/>
-            </w:tcMar>
-            <w:vAlign w:val="center"/>
-          </w:tcPr>
-          <w:p>
-            <w:pPr>
-              <w:spacing w:after="200" w:before="200"/>
-              <w:jc w:val="center"/>
-            </w:pPr>
-            <w:r>
-              <w:rPr>
-                <w:rFonts w:ascii="Calibri" w:cs="Calibri" w:eastAsia="Calibri" w:hAnsi="Calibri"/>
-                <w:b/>
-                <w:bCs/>
-                <w:color w:val="FFFFFF"/>
-                <w:sz w:val="40"/>
-                <w:szCs w:val="40"/>
-              </w:rPr>
-              <w:t xml:space="preserve">SOFTWARE REQUIREMENTS SPECIFICATION</w:t>
-            </w:r>
-          </w:p>
-          <w:p>
-            <w:pPr>
-              <w:spacing w:after="300" w:before="100"/>
-              <w:jc w:val="center"/>
-            </w:pPr>
-            <w:r>
-              <w:rPr>
-                <w:rFonts w:ascii="Calibri" w:cs="Calibri" w:eastAsia="Calibri" w:hAnsi="Calibri"/>
-                <w:b/>
-                <w:bCs/>
-                <w:color w:val="FFFFFF"/>
-                <w:sz w:val="30"/>
-                <w:szCs w:val="30"/>
-              </w:rPr>
-              <w:t xml:space="preserve">PROJECT: RENTAMOVIL — PLATFORM FOR A VEHICLE RENTAL COMPANY</w:t>
-            </w:r>
-          </w:p>
-          <w:p>
-            <w:pPr>
-              <w:spacing w:after="160" w:line="276"/>
-              <w:jc w:val="center"/>
-            </w:pPr>
-            <w:r>
-              <w:rPr>
-                <w:rFonts w:ascii="Calibri" w:cs="Calibri" w:eastAsia="Calibri" w:hAnsi="Calibri"/>
-                <w:b/>
-                <w:bCs/>
-                <w:color w:val="FFFFFF"/>
-                <w:sz w:val="21"/>
-                <w:szCs w:val="21"/>
-              </w:rPr>
-              <w:t xml:space="preserve">TEAM MEMBERS:</w:t>
-            </w:r>
-            <w:r>
-              <w:rPr>
-                <w:rFonts w:ascii="Calibri" w:cs="Calibri" w:eastAsia="Calibri" w:hAnsi="Calibri"/>
-                <w:color w:val="FFFFFF"/>
-                <w:sz w:val="21"/>
-                <w:szCs w:val="21"/>
-              </w:rPr>
-              <w:t xml:space="preserve"> Thiago Fabian Rojas Guevara — David Santiago Erez Rodríguez — Nicole Dayana Ramírez Vargas</w:t>
-            </w:r>
-          </w:p>
-          <w:p>
-            <w:pPr>
-              <w:spacing w:after="160" w:line="276"/>
-              <w:jc w:val="center"/>
-            </w:pPr>
-            <w:r>
-              <w:rPr>
-                <w:rFonts w:ascii="Calibri" w:cs="Calibri" w:eastAsia="Calibri" w:hAnsi="Calibri"/>
-                <w:b/>
-                <w:bCs/>
-                <w:color w:val="FFFFFF"/>
-                <w:sz w:val="21"/>
-                <w:szCs w:val="21"/>
-              </w:rPr>
-              <w:t xml:space="preserve">SERVICIO NACIONAL DE APRENDIZAJE — SENA — SOFTWARE ANALYSIS AND DEVELOPMENT 3145556</w:t>
-            </w:r>
-          </w:p>
-          <w:p>
-            <w:pPr>
-              <w:spacing w:after="160" w:line="276"/>
-              <w:jc w:val="center"/>
-            </w:pPr>
-            <w:r>
-              <w:rPr>
-                <w:rFonts w:ascii="Calibri" w:cs="Calibri" w:eastAsia="Calibri" w:hAnsi="Calibri"/>
-                <w:b/>
-                <w:bCs/>
-                <w:color w:val="FFFFFF"/>
-                <w:sz w:val="21"/>
-                <w:szCs w:val="21"/>
-              </w:rPr>
-              <w:t xml:space="preserve">2026</w:t>
-            </w:r>
-          </w:p>
-        </w:tc>
-      </w:tr>
-    </w:tbl>
+    <w:p>
+      <w:pPr>
+        <w:spacing w:after="200" w:before="200"/>
+        <w:jc w:val="center"/>
+      </w:pPr>
+      <w:r>
+        <w:rPr>
+          <w:rFonts w:ascii="Calibri" w:cs="Calibri" w:eastAsia="Calibri" w:hAnsi="Calibri"/>
+          <w:b/>
+          <w:bCs/>
+          <w:sz w:val="32"/>
+          <w:szCs w:val="32"/>
+        </w:rPr>
+        <w:t xml:space="preserve">SOFTWARE REQUIREMENTS SPECIFICATION</w:t>
+      </w:r>
+    </w:p>
+    <w:p>
+      <w:pPr>
+        <w:spacing w:after="400" w:before="400"/>
+        <w:jc w:val="center"/>
+      </w:pPr>
+      <w:r>
+        <w:rPr>
+          <w:rFonts w:ascii="Calibri" w:cs="Calibri" w:eastAsia="Calibri" w:hAnsi="Calibri"/>
+          <w:b w:val="false"/>
+          <w:bCs w:val="false"/>
+          <w:sz w:val="24"/>
+          <w:szCs w:val="24"/>
+        </w:rPr>
+        <w:t xml:space="preserve">PROJECT: RENTAMOVIL — PLATFORM FOR A VEHICLE RENTAL COMPANY</w:t>
+      </w:r>
+    </w:p>
+    <w:p>
+      <w:pPr>
+        <w:spacing w:after="300" w:before="300" w:line="276"/>
+        <w:jc w:val="center"/>
+      </w:pPr>
+      <w:r>
+        <w:rPr>
+          <w:rFonts w:ascii="Calibri" w:cs="Calibri" w:eastAsia="Calibri" w:hAnsi="Calibri"/>
+          <w:b/>
+          <w:bCs/>
+          <w:sz w:val="21"/>
+          <w:szCs w:val="21"/>
+        </w:rPr>
+        <w:t xml:space="preserve">TEAM MEMBERS:</w:t>
+      </w:r>
+      <w:r>
+        <w:rPr>
+          <w:rFonts w:ascii="Calibri" w:cs="Calibri" w:eastAsia="Calibri" w:hAnsi="Calibri"/>
+          <w:sz w:val="21"/>
+          <w:szCs w:val="21"/>
+        </w:rPr>
+        <w:t xml:space="preserve"> Thiago Fabian Rojas Guevara — David Santiago Erez Rodríguez — Nicole Dayana Ramírez Vargas</w:t>
+      </w:r>
+    </w:p>
+    <w:p>
+      <w:pPr>
+        <w:spacing w:after="300" w:before="300" w:line="276"/>
+        <w:jc w:val="center"/>
+      </w:pPr>
+      <w:r>
+        <w:rPr>
+          <w:rFonts w:ascii="Calibri" w:cs="Calibri" w:eastAsia="Calibri" w:hAnsi="Calibri"/>
+          <w:b/>
+          <w:bCs/>
+          <w:sz w:val="21"/>
+          <w:szCs w:val="21"/>
+        </w:rPr>
+        <w:t xml:space="preserve">SERVICIO NACIONAL DE APRENDIZAJE — SENA — SOFTWARE ANALYSIS AND DEVELOPMENT 3145556</w:t>
+      </w:r>
+    </w:p>
+    <w:p>
+      <w:pPr>
+        <w:spacing w:after="300" w:before="300" w:line="276"/>
+        <w:jc w:val="center"/>
+      </w:pPr>
+      <w:r>
+        <w:rPr>
+          <w:rFonts w:ascii="Calibri" w:cs="Calibri" w:eastAsia="Calibri" w:hAnsi="Calibri"/>
+          <w:b/>
+          <w:bCs/>
+          <w:sz w:val="21"/>
+          <w:szCs w:val="21"/>
+        </w:rPr>
+        <w:t xml:space="preserve">2026</w:t>
+      </w:r>
+    </w:p>
     <w:p>
       <w:r>
         <w:br w:type="page"/>

</xml_diff>